<commit_message>
feat: add labelled dataset generator (36 resumes, 6 JDs, ground truth)
</commit_message>
<xml_diff>
--- a/resumes/jane_smith.docx
+++ b/resumes/jane_smith.docx
@@ -12,12 +12,12 @@
     </w:p>
     <w:p>
       <w:r>
-        <w:t>Frontend Engineer</w:t>
+        <w:t>Senior Frontend Engineer</w:t>
       </w:r>
     </w:p>
     <w:p>
       <w:r>
-        <w:t>jane.smith@example.com</w:t>
+        <w:t>Singapore | jane.smith@example.com | +1-555-0101</w:t>
       </w:r>
     </w:p>
     <w:p>
@@ -25,12 +25,12 @@
         <w:pStyle w:val="Heading1"/>
       </w:pPr>
       <w:r>
-        <w:t>Summary</w:t>
+        <w:t>PROFILE</w:t>
       </w:r>
     </w:p>
     <w:p>
       <w:r>
-        <w:t>Frontend engineer focused on React and TypeScript design systems.</w:t>
+        <w:t>Senior Frontend Engineer with 9+ years of experience specialising in JavaScript, TypeScript, React. Track record of delivering reliable, measurable results in production systems.</w:t>
       </w:r>
     </w:p>
     <w:p>
@@ -38,12 +38,12 @@
         <w:pStyle w:val="Heading1"/>
       </w:pPr>
       <w:r>
-        <w:t>Skills</w:t>
+        <w:t>CORE COMPETENCIES</w:t>
       </w:r>
     </w:p>
     <w:p>
       <w:r>
-        <w:t>JavaScript, TypeScript, React, CSS, Next.js</w:t>
+        <w:t>JavaScript, TypeScript, React, CSS, HTML, GraphQL, Tailwind CSS, Redux, Cypress</w:t>
       </w:r>
     </w:p>
     <w:p>
@@ -51,7 +51,25 @@
         <w:pStyle w:val="Heading1"/>
       </w:pPr>
       <w:r>
-        <w:t>Experience</w:t>
+        <w:t>EDUCATION &amp; TRAINING</w:t>
+      </w:r>
+    </w:p>
+    <w:p>
+      <w:r>
+        <w:t>M.Tech in Computer Science, Riverside University (2017)</w:t>
+      </w:r>
+    </w:p>
+    <w:p>
+      <w:pPr>
+        <w:pStyle w:val="Heading1"/>
+      </w:pPr>
+      <w:r>
+        <w:t>EMPLOYMENT HISTORY</w:t>
+      </w:r>
+    </w:p>
+    <w:p>
+      <w:r>
+        <w:t>Senior Frontend Developer, Clearpath Energy (2023 - Present)</w:t>
       </w:r>
     </w:p>
     <w:p>
@@ -59,7 +77,7 @@
         <w:pStyle w:val="ListBullet"/>
       </w:pPr>
       <w:r>
-        <w:t>Senior Frontend Engineer, Pixel Labs (2019-2025): owned the component library used across 12 products.</w:t>
+        <w:t>Migrated a legacy UI to Tailwind CSS with GraphQL, cutting bundle size 30%.</w:t>
       </w:r>
     </w:p>
     <w:p>
@@ -67,7 +85,62 @@
         <w:pStyle w:val="ListBullet"/>
       </w:pPr>
       <w:r>
-        <w:t>UI Developer, Bright Apps (2016-2019): shipped responsive web apps.</w:t>
+        <w:t>Shipped accessible Cypress components meeting WCAG 2.1 AA.</w:t>
+      </w:r>
+    </w:p>
+    <w:p>
+      <w:r>
+        <w:t>Frontend Engineer, Orchid Media (2019 - 2023)</w:t>
+      </w:r>
+    </w:p>
+    <w:p>
+      <w:pPr>
+        <w:pStyle w:val="ListBullet"/>
+      </w:pPr>
+      <w:r>
+        <w:t>Shipped accessible Redux components meeting WCAG 2.1 AA.</w:t>
+      </w:r>
+    </w:p>
+    <w:p>
+      <w:pPr>
+        <w:pStyle w:val="ListBullet"/>
+      </w:pPr>
+      <w:r>
+        <w:t>Built a HTML design system used across 4 product teams.</w:t>
+      </w:r>
+    </w:p>
+    <w:p>
+      <w:r>
+        <w:t>Frontend Developer, FinServe (2017 - 2019)</w:t>
+      </w:r>
+    </w:p>
+    <w:p>
+      <w:pPr>
+        <w:pStyle w:val="ListBullet"/>
+      </w:pPr>
+      <w:r>
+        <w:t>Improved Core Web Vitals 20% by optimising GraphQL rendering.</w:t>
+      </w:r>
+    </w:p>
+    <w:p>
+      <w:pPr>
+        <w:pStyle w:val="ListBullet"/>
+      </w:pPr>
+      <w:r>
+        <w:t>Shipped accessible GraphQL components meeting WCAG 2.1 AA.</w:t>
+      </w:r>
+    </w:p>
+    <w:p>
+      <w:pPr>
+        <w:pStyle w:val="Heading1"/>
+      </w:pPr>
+      <w:r>
+        <w:t>KEY PROJECTS</w:t>
+      </w:r>
+    </w:p>
+    <w:p>
+      <w:r>
+        <w:t>Dashboard Kit: reusable React charting components with Tailwind CSS.</w:t>
       </w:r>
     </w:p>
     <w:sectPr>

</xml_diff>